<commit_message>
14. Hafta Finitooo DBMS Finitooo
</commit_message>
<xml_diff>
--- a/Raporlar/14. Hafta.docx
+++ b/Raporlar/14. Hafta.docx
@@ -227,7 +227,7 @@
               <w:t xml:space="preserve"> </w:t>
             </w:r>
             <w:r>
-              <w:t>Üçüncü</w:t>
+              <w:t>Dördüncü</w:t>
             </w:r>
             <w:r>
               <w:t xml:space="preserve"> </w:t>
@@ -400,10 +400,407 @@
           <w:b/>
         </w:rPr>
       </w:pPr>
+      <w:r>
+        <w:rPr>
+          <w:b/>
+        </w:rPr>
+        <w:t>View</w:t>
+      </w:r>
+    </w:p>
+    <w:p>
+      <w:pPr>
+        <w:pStyle w:val="ListeParagraf"/>
+        <w:numPr>
+          <w:ilvl w:val="1"/>
+          <w:numId w:val="26"/>
+        </w:numPr>
+        <w:spacing w:after="0" w:line="240" w:lineRule="auto"/>
+        <w:rPr>
+          <w:b/>
+        </w:rPr>
+      </w:pPr>
+      <w:r>
+        <w:rPr>
+          <w:b/>
+        </w:rPr>
+        <w:t>View Tanımlanması</w:t>
+      </w:r>
+    </w:p>
+    <w:p>
+      <w:pPr>
+        <w:spacing w:after="0" w:line="240" w:lineRule="auto"/>
+        <w:rPr>
+          <w:b/>
+        </w:rPr>
+      </w:pPr>
+    </w:p>
+    <w:p>
+      <w:pPr>
+        <w:spacing w:after="0" w:line="240" w:lineRule="auto"/>
+        <w:ind w:left="1440"/>
+        <w:rPr>
+          <w:b/>
+        </w:rPr>
+      </w:pPr>
+      <w:r>
+        <w:rPr>
+          <w:b/>
+        </w:rPr>
+        <w:t>CREATE VIEW YazarKitapBilgi AS</w:t>
+      </w:r>
+    </w:p>
+    <w:p>
+      <w:pPr>
+        <w:spacing w:after="0" w:line="240" w:lineRule="auto"/>
+        <w:ind w:left="1440"/>
+        <w:rPr>
+          <w:b/>
+        </w:rPr>
+      </w:pPr>
+      <w:r>
+        <w:rPr>
+          <w:b/>
+        </w:rPr>
+        <w:t xml:space="preserve">SELECT </w:t>
+      </w:r>
+    </w:p>
+    <w:p>
+      <w:pPr>
+        <w:spacing w:after="0" w:line="240" w:lineRule="auto"/>
+        <w:ind w:left="1440"/>
+        <w:rPr>
+          <w:b/>
+        </w:rPr>
+      </w:pPr>
+      <w:r>
+        <w:rPr>
+          <w:b/>
+        </w:rPr>
+        <w:t xml:space="preserve">    Yazar.YazarAdi AS "Yazar Adı",</w:t>
+      </w:r>
+    </w:p>
+    <w:p>
+      <w:pPr>
+        <w:spacing w:after="0" w:line="240" w:lineRule="auto"/>
+        <w:ind w:left="1440"/>
+        <w:rPr>
+          <w:b/>
+        </w:rPr>
+      </w:pPr>
+      <w:r>
+        <w:rPr>
+          <w:b/>
+        </w:rPr>
+        <w:t xml:space="preserve">    Yazar.YazarSoyad AS "Yazar Soyadı",</w:t>
+      </w:r>
+    </w:p>
+    <w:p>
+      <w:pPr>
+        <w:spacing w:after="0" w:line="240" w:lineRule="auto"/>
+        <w:ind w:left="1440"/>
+        <w:rPr>
+          <w:b/>
+        </w:rPr>
+      </w:pPr>
+      <w:r>
+        <w:rPr>
+          <w:b/>
+        </w:rPr>
+        <w:t xml:space="preserve">    Kitap.KitapAdi AS "Kitap Adı",</w:t>
+      </w:r>
+    </w:p>
+    <w:p>
+      <w:pPr>
+        <w:spacing w:after="0" w:line="240" w:lineRule="auto"/>
+        <w:ind w:left="1440"/>
+        <w:rPr>
+          <w:b/>
+        </w:rPr>
+      </w:pPr>
+      <w:r>
+        <w:rPr>
+          <w:b/>
+        </w:rPr>
+        <w:t xml:space="preserve">    Kitap.ISBN AS "ISBN",</w:t>
+      </w:r>
+    </w:p>
+    <w:p>
+      <w:pPr>
+        <w:spacing w:after="0" w:line="240" w:lineRule="auto"/>
+        <w:ind w:left="1440"/>
+        <w:rPr>
+          <w:b/>
+        </w:rPr>
+      </w:pPr>
+      <w:r>
+        <w:rPr>
+          <w:b/>
+        </w:rPr>
+        <w:t xml:space="preserve">    Kitap.BasimYili AS "Basım Yılı",</w:t>
+      </w:r>
+    </w:p>
+    <w:p>
+      <w:pPr>
+        <w:spacing w:after="0" w:line="240" w:lineRule="auto"/>
+        <w:ind w:left="1440"/>
+        <w:rPr>
+          <w:b/>
+        </w:rPr>
+      </w:pPr>
+      <w:r>
+        <w:rPr>
+          <w:b/>
+        </w:rPr>
+        <w:t xml:space="preserve">    Kitap.Yayinevi AS "Yayınevi",</w:t>
+      </w:r>
+    </w:p>
+    <w:p>
+      <w:pPr>
+        <w:spacing w:after="0" w:line="240" w:lineRule="auto"/>
+        <w:ind w:left="1440"/>
+        <w:rPr>
+          <w:b/>
+        </w:rPr>
+      </w:pPr>
+      <w:r>
+        <w:rPr>
+          <w:b/>
+        </w:rPr>
+        <w:t xml:space="preserve">    Kategori.Turu AS "Kategori"</w:t>
+      </w:r>
+    </w:p>
+    <w:p>
+      <w:pPr>
+        <w:spacing w:after="0" w:line="240" w:lineRule="auto"/>
+        <w:ind w:left="1440"/>
+        <w:rPr>
+          <w:b/>
+        </w:rPr>
+      </w:pPr>
+      <w:r>
+        <w:rPr>
+          <w:b/>
+        </w:rPr>
+        <w:t xml:space="preserve">FROM </w:t>
+      </w:r>
+    </w:p>
+    <w:p>
+      <w:pPr>
+        <w:spacing w:after="0" w:line="240" w:lineRule="auto"/>
+        <w:ind w:left="1440"/>
+        <w:rPr>
+          <w:b/>
+        </w:rPr>
+      </w:pPr>
+      <w:r>
+        <w:rPr>
+          <w:b/>
+        </w:rPr>
+        <w:t xml:space="preserve">    Yazar</w:t>
+      </w:r>
+    </w:p>
+    <w:p>
+      <w:pPr>
+        <w:spacing w:after="0" w:line="240" w:lineRule="auto"/>
+        <w:ind w:left="1440"/>
+        <w:rPr>
+          <w:b/>
+        </w:rPr>
+      </w:pPr>
+      <w:r>
+        <w:rPr>
+          <w:b/>
+        </w:rPr>
+        <w:t xml:space="preserve">LEFT JOIN </w:t>
+      </w:r>
+    </w:p>
+    <w:p>
+      <w:pPr>
+        <w:spacing w:after="0" w:line="240" w:lineRule="auto"/>
+        <w:ind w:left="1440"/>
+        <w:rPr>
+          <w:b/>
+        </w:rPr>
+      </w:pPr>
+      <w:r>
+        <w:rPr>
+          <w:b/>
+        </w:rPr>
+        <w:t xml:space="preserve">    Kitap ON Yazar.YazarID = Kitap.YazarID</w:t>
+      </w:r>
+    </w:p>
+    <w:p>
+      <w:pPr>
+        <w:spacing w:after="0" w:line="240" w:lineRule="auto"/>
+        <w:ind w:left="1440"/>
+        <w:rPr>
+          <w:b/>
+        </w:rPr>
+      </w:pPr>
+      <w:r>
+        <w:rPr>
+          <w:b/>
+        </w:rPr>
+        <w:t xml:space="preserve">LEFT JOIN </w:t>
+      </w:r>
+    </w:p>
+    <w:p>
+      <w:pPr>
+        <w:spacing w:after="0" w:line="240" w:lineRule="auto"/>
+        <w:ind w:left="1440"/>
+        <w:rPr>
+          <w:b/>
+        </w:rPr>
+      </w:pPr>
+      <w:r>
+        <w:rPr>
+          <w:b/>
+        </w:rPr>
+        <w:t xml:space="preserve">    Kategori ON Kitap.KategoriID = Kategori.KategoriID;</w:t>
+      </w:r>
+    </w:p>
+    <w:p>
+      <w:pPr>
+        <w:spacing w:after="0" w:line="240" w:lineRule="auto"/>
+        <w:rPr>
+          <w:b/>
+        </w:rPr>
+      </w:pPr>
+    </w:p>
+    <w:p>
+      <w:pPr>
+        <w:spacing w:after="0" w:line="240" w:lineRule="auto"/>
+        <w:ind w:left="1440"/>
+        <w:rPr>
+          <w:i/>
+        </w:rPr>
+      </w:pPr>
+      <w:r>
+        <w:rPr>
+          <w:i/>
+        </w:rPr>
+        <w:t>-- LEFT JOIN: Eğer ikinci tabloda eşleşen bir kayıt yoksa, birinci tablodaki değerler aynen korunur, ancak ikinci tablodan alınması gereken sütunlar NULL olarak döner. Kısaca bir yazarın henüz bir kitabı yoksa</w:t>
+      </w:r>
+      <w:r>
+        <w:rPr>
+          <w:i/>
+        </w:rPr>
+        <w:t xml:space="preserve"> yazarın bilgileri görünür fakat kitap bilgileri null olarak görünür.</w:t>
+      </w:r>
+    </w:p>
+    <w:p>
+      <w:pPr>
+        <w:spacing w:after="0" w:line="240" w:lineRule="auto"/>
+        <w:rPr>
+          <w:i/>
+        </w:rPr>
+      </w:pPr>
+    </w:p>
+    <w:p>
+      <w:pPr>
+        <w:pStyle w:val="ListeParagraf"/>
+        <w:numPr>
+          <w:ilvl w:val="0"/>
+          <w:numId w:val="27"/>
+        </w:numPr>
+        <w:spacing w:after="0" w:line="240" w:lineRule="auto"/>
+        <w:rPr>
+          <w:b/>
+        </w:rPr>
+      </w:pPr>
+      <w:r>
+        <w:rPr>
+          <w:b/>
+        </w:rPr>
+        <w:t>View Çalıştırılması</w:t>
+      </w:r>
+    </w:p>
+    <w:p>
+      <w:pPr>
+        <w:spacing w:after="0" w:line="240" w:lineRule="auto"/>
+        <w:rPr>
+          <w:b/>
+        </w:rPr>
+      </w:pPr>
+    </w:p>
+    <w:p>
+      <w:pPr>
+        <w:spacing w:after="0" w:line="240" w:lineRule="auto"/>
+        <w:ind w:left="1440"/>
+        <w:rPr>
+          <w:b/>
+        </w:rPr>
+      </w:pPr>
+      <w:r>
+        <w:rPr>
+          <w:b/>
+        </w:rPr>
+        <w:t>SELECT * FROM YazarKitapBilgi;</w:t>
+      </w:r>
+    </w:p>
+    <w:p>
+      <w:pPr>
+        <w:spacing w:after="0" w:line="240" w:lineRule="auto"/>
+        <w:rPr>
+          <w:b/>
+        </w:rPr>
+      </w:pPr>
+      <w:r>
+        <w:rPr>
+          <w:b/>
+          <w:noProof/>
+          <w:lang w:eastAsia="tr-TR"/>
+        </w:rPr>
+        <w:drawing>
+          <wp:inline distT="0" distB="0" distL="0" distR="0">
+            <wp:extent cx="5944184" cy="2070022"/>
+            <wp:effectExtent l="19050" t="0" r="0" b="0"/>
+            <wp:docPr id="7" name="Resim 7"/>
+            <wp:cNvGraphicFramePr>
+              <a:graphicFrameLocks xmlns:a="http://schemas.openxmlformats.org/drawingml/2006/main" noChangeAspect="1"/>
+            </wp:cNvGraphicFramePr>
+            <a:graphic xmlns:a="http://schemas.openxmlformats.org/drawingml/2006/main">
+              <a:graphicData uri="http://schemas.openxmlformats.org/drawingml/2006/picture">
+                <pic:pic xmlns:pic="http://schemas.openxmlformats.org/drawingml/2006/picture">
+                  <pic:nvPicPr>
+                    <pic:cNvPr id="0" name="Picture 7"/>
+                    <pic:cNvPicPr>
+                      <a:picLocks noChangeAspect="1" noChangeArrowheads="1"/>
+                    </pic:cNvPicPr>
+                  </pic:nvPicPr>
+                  <pic:blipFill>
+                    <a:blip r:embed="rId7"/>
+                    <a:srcRect/>
+                    <a:stretch>
+                      <a:fillRect/>
+                    </a:stretch>
+                  </pic:blipFill>
+                  <pic:spPr bwMode="auto">
+                    <a:xfrm>
+                      <a:off x="0" y="0"/>
+                      <a:ext cx="5943600" cy="2069819"/>
+                    </a:xfrm>
+                    <a:prstGeom prst="rect">
+                      <a:avLst/>
+                    </a:prstGeom>
+                    <a:noFill/>
+                    <a:ln w="9525">
+                      <a:noFill/>
+                      <a:miter lim="800000"/>
+                      <a:headEnd/>
+                      <a:tailEnd/>
+                    </a:ln>
+                  </pic:spPr>
+                </pic:pic>
+              </a:graphicData>
+            </a:graphic>
+          </wp:inline>
+        </w:drawing>
+      </w:r>
     </w:p>
     <w:sectPr>
-      <w:footerReference w:type="even" r:id="rId7"/>
-      <w:footerReference w:type="default" r:id="rId8"/>
+      <w:footerReference w:type="even" r:id="rId8"/>
+      <w:footerReference w:type="default" r:id="rId9"/>
       <w:pgSz w:w="12240" w:h="15840"/>
       <w:pgMar w:top="1440" w:right="1440" w:bottom="1440" w:left="1440" w:header="720" w:footer="720" w:gutter="0"/>
       <w:cols w:space="720"/>
@@ -811,7 +1208,7 @@
   <w:abstractNum w:abstractNumId="2">
     <w:nsid w:val="135F51E8"/>
     <w:multiLevelType w:val="hybridMultilevel"/>
-    <w:tmpl w:val="FE78D346"/>
+    <w:tmpl w:val="50FEA70A"/>
     <w:lvl w:ilvl="0" w:tplc="041F000F">
       <w:start w:val="1"/>
       <w:numFmt w:val="decimal"/>
@@ -821,14 +1218,17 @@
         <w:ind w:left="720" w:hanging="360"/>
       </w:pPr>
     </w:lvl>
-    <w:lvl w:ilvl="1" w:tplc="041F0019" w:tentative="1">
-      <w:start w:val="1"/>
-      <w:numFmt w:val="lowerLetter"/>
-      <w:lvlText w:val="%2."/>
+    <w:lvl w:ilvl="1" w:tplc="041F0001">
+      <w:start w:val="1"/>
+      <w:numFmt w:val="bullet"/>
+      <w:lvlText w:val=""/>
       <w:lvlJc w:val="left"/>
       <w:pPr>
         <w:ind w:left="1440" w:hanging="360"/>
       </w:pPr>
+      <w:rPr>
+        <w:rFonts w:ascii="Symbol" w:hAnsi="Symbol" w:hint="default"/>
+      </w:rPr>
     </w:lvl>
     <w:lvl w:ilvl="2" w:tplc="041F001B" w:tentative="1">
       <w:start w:val="1"/>
@@ -2150,6 +2550,119 @@
     </w:lvl>
   </w:abstractNum>
   <w:abstractNum w:abstractNumId="15">
+    <w:nsid w:val="4AEF7F25"/>
+    <w:multiLevelType w:val="hybridMultilevel"/>
+    <w:tmpl w:val="E214B748"/>
+    <w:lvl w:ilvl="0" w:tplc="041F0001">
+      <w:start w:val="1"/>
+      <w:numFmt w:val="bullet"/>
+      <w:lvlText w:val=""/>
+      <w:lvlJc w:val="left"/>
+      <w:pPr>
+        <w:ind w:left="1444" w:hanging="360"/>
+      </w:pPr>
+      <w:rPr>
+        <w:rFonts w:ascii="Symbol" w:hAnsi="Symbol" w:hint="default"/>
+      </w:rPr>
+    </w:lvl>
+    <w:lvl w:ilvl="1" w:tplc="041F0003" w:tentative="1">
+      <w:start w:val="1"/>
+      <w:numFmt w:val="bullet"/>
+      <w:lvlText w:val="o"/>
+      <w:lvlJc w:val="left"/>
+      <w:pPr>
+        <w:ind w:left="2164" w:hanging="360"/>
+      </w:pPr>
+      <w:rPr>
+        <w:rFonts w:ascii="Courier New" w:hAnsi="Courier New" w:cs="Courier New" w:hint="default"/>
+      </w:rPr>
+    </w:lvl>
+    <w:lvl w:ilvl="2" w:tplc="041F0005" w:tentative="1">
+      <w:start w:val="1"/>
+      <w:numFmt w:val="bullet"/>
+      <w:lvlText w:val=""/>
+      <w:lvlJc w:val="left"/>
+      <w:pPr>
+        <w:ind w:left="2884" w:hanging="360"/>
+      </w:pPr>
+      <w:rPr>
+        <w:rFonts w:ascii="Wingdings" w:hAnsi="Wingdings" w:hint="default"/>
+      </w:rPr>
+    </w:lvl>
+    <w:lvl w:ilvl="3" w:tplc="041F0001" w:tentative="1">
+      <w:start w:val="1"/>
+      <w:numFmt w:val="bullet"/>
+      <w:lvlText w:val=""/>
+      <w:lvlJc w:val="left"/>
+      <w:pPr>
+        <w:ind w:left="3604" w:hanging="360"/>
+      </w:pPr>
+      <w:rPr>
+        <w:rFonts w:ascii="Symbol" w:hAnsi="Symbol" w:hint="default"/>
+      </w:rPr>
+    </w:lvl>
+    <w:lvl w:ilvl="4" w:tplc="041F0003" w:tentative="1">
+      <w:start w:val="1"/>
+      <w:numFmt w:val="bullet"/>
+      <w:lvlText w:val="o"/>
+      <w:lvlJc w:val="left"/>
+      <w:pPr>
+        <w:ind w:left="4324" w:hanging="360"/>
+      </w:pPr>
+      <w:rPr>
+        <w:rFonts w:ascii="Courier New" w:hAnsi="Courier New" w:cs="Courier New" w:hint="default"/>
+      </w:rPr>
+    </w:lvl>
+    <w:lvl w:ilvl="5" w:tplc="041F0005" w:tentative="1">
+      <w:start w:val="1"/>
+      <w:numFmt w:val="bullet"/>
+      <w:lvlText w:val=""/>
+      <w:lvlJc w:val="left"/>
+      <w:pPr>
+        <w:ind w:left="5044" w:hanging="360"/>
+      </w:pPr>
+      <w:rPr>
+        <w:rFonts w:ascii="Wingdings" w:hAnsi="Wingdings" w:hint="default"/>
+      </w:rPr>
+    </w:lvl>
+    <w:lvl w:ilvl="6" w:tplc="041F0001" w:tentative="1">
+      <w:start w:val="1"/>
+      <w:numFmt w:val="bullet"/>
+      <w:lvlText w:val=""/>
+      <w:lvlJc w:val="left"/>
+      <w:pPr>
+        <w:ind w:left="5764" w:hanging="360"/>
+      </w:pPr>
+      <w:rPr>
+        <w:rFonts w:ascii="Symbol" w:hAnsi="Symbol" w:hint="default"/>
+      </w:rPr>
+    </w:lvl>
+    <w:lvl w:ilvl="7" w:tplc="041F0003" w:tentative="1">
+      <w:start w:val="1"/>
+      <w:numFmt w:val="bullet"/>
+      <w:lvlText w:val="o"/>
+      <w:lvlJc w:val="left"/>
+      <w:pPr>
+        <w:ind w:left="6484" w:hanging="360"/>
+      </w:pPr>
+      <w:rPr>
+        <w:rFonts w:ascii="Courier New" w:hAnsi="Courier New" w:cs="Courier New" w:hint="default"/>
+      </w:rPr>
+    </w:lvl>
+    <w:lvl w:ilvl="8" w:tplc="041F0005" w:tentative="1">
+      <w:start w:val="1"/>
+      <w:numFmt w:val="bullet"/>
+      <w:lvlText w:val=""/>
+      <w:lvlJc w:val="left"/>
+      <w:pPr>
+        <w:ind w:left="7204" w:hanging="360"/>
+      </w:pPr>
+      <w:rPr>
+        <w:rFonts w:ascii="Wingdings" w:hAnsi="Wingdings" w:hint="default"/>
+      </w:rPr>
+    </w:lvl>
+  </w:abstractNum>
+  <w:abstractNum w:abstractNumId="16">
     <w:nsid w:val="4EB2580C"/>
     <w:multiLevelType w:val="hybridMultilevel"/>
     <w:tmpl w:val="8E9A4B0C"/>
@@ -2238,7 +2751,7 @@
       </w:pPr>
     </w:lvl>
   </w:abstractNum>
-  <w:abstractNum w:abstractNumId="16">
+  <w:abstractNum w:abstractNumId="17">
     <w:nsid w:val="51742478"/>
     <w:multiLevelType w:val="hybridMultilevel"/>
     <w:tmpl w:val="B122E23A"/>
@@ -2351,7 +2864,7 @@
       </w:rPr>
     </w:lvl>
   </w:abstractNum>
-  <w:abstractNum w:abstractNumId="17">
+  <w:abstractNum w:abstractNumId="18">
     <w:nsid w:val="57285F2B"/>
     <w:multiLevelType w:val="hybridMultilevel"/>
     <w:tmpl w:val="74C29DB4"/>
@@ -2464,7 +2977,7 @@
       </w:rPr>
     </w:lvl>
   </w:abstractNum>
-  <w:abstractNum w:abstractNumId="18">
+  <w:abstractNum w:abstractNumId="19">
     <w:nsid w:val="608C385D"/>
     <w:multiLevelType w:val="hybridMultilevel"/>
     <w:tmpl w:val="E9003612"/>
@@ -2577,7 +3090,7 @@
       </w:rPr>
     </w:lvl>
   </w:abstractNum>
-  <w:abstractNum w:abstractNumId="19">
+  <w:abstractNum w:abstractNumId="20">
     <w:nsid w:val="63CB2BAE"/>
     <w:multiLevelType w:val="hybridMultilevel"/>
     <w:tmpl w:val="EB4A1F70"/>
@@ -2690,7 +3203,7 @@
       </w:rPr>
     </w:lvl>
   </w:abstractNum>
-  <w:abstractNum w:abstractNumId="20">
+  <w:abstractNum w:abstractNumId="21">
     <w:nsid w:val="6D120F80"/>
     <w:multiLevelType w:val="hybridMultilevel"/>
     <w:tmpl w:val="C6540966"/>
@@ -2776,7 +3289,7 @@
       </w:pPr>
     </w:lvl>
   </w:abstractNum>
-  <w:abstractNum w:abstractNumId="21">
+  <w:abstractNum w:abstractNumId="22">
     <w:nsid w:val="6D274AD7"/>
     <w:multiLevelType w:val="hybridMultilevel"/>
     <w:tmpl w:val="C002B63C"/>
@@ -2862,7 +3375,7 @@
       </w:pPr>
     </w:lvl>
   </w:abstractNum>
-  <w:abstractNum w:abstractNumId="22">
+  <w:abstractNum w:abstractNumId="23">
     <w:nsid w:val="6E15636C"/>
     <w:multiLevelType w:val="hybridMultilevel"/>
     <w:tmpl w:val="BEB4B8AC"/>
@@ -2975,7 +3488,7 @@
       </w:rPr>
     </w:lvl>
   </w:abstractNum>
-  <w:abstractNum w:abstractNumId="23">
+  <w:abstractNum w:abstractNumId="24">
     <w:nsid w:val="6E6F54DD"/>
     <w:multiLevelType w:val="hybridMultilevel"/>
     <w:tmpl w:val="CC5C6D6E"/>
@@ -3088,7 +3601,7 @@
       </w:rPr>
     </w:lvl>
   </w:abstractNum>
-  <w:abstractNum w:abstractNumId="24">
+  <w:abstractNum w:abstractNumId="25">
     <w:nsid w:val="72451ECC"/>
     <w:multiLevelType w:val="hybridMultilevel"/>
     <w:tmpl w:val="67EE73A4"/>
@@ -3174,7 +3687,7 @@
       </w:pPr>
     </w:lvl>
   </w:abstractNum>
-  <w:abstractNum w:abstractNumId="25">
+  <w:abstractNum w:abstractNumId="26">
     <w:nsid w:val="77D14C68"/>
     <w:multiLevelType w:val="hybridMultilevel"/>
     <w:tmpl w:val="F47CFA2E"/>
@@ -3261,13 +3774,13 @@
     </w:lvl>
   </w:abstractNum>
   <w:num w:numId="1">
-    <w:abstractNumId w:val="24"/>
+    <w:abstractNumId w:val="25"/>
   </w:num>
   <w:num w:numId="2">
     <w:abstractNumId w:val="7"/>
   </w:num>
   <w:num w:numId="3">
-    <w:abstractNumId w:val="21"/>
+    <w:abstractNumId w:val="22"/>
   </w:num>
   <w:num w:numId="4">
     <w:abstractNumId w:val="6"/>
@@ -3285,19 +3798,19 @@
     <w:abstractNumId w:val="8"/>
   </w:num>
   <w:num w:numId="9">
-    <w:abstractNumId w:val="20"/>
+    <w:abstractNumId w:val="21"/>
   </w:num>
   <w:num w:numId="10">
-    <w:abstractNumId w:val="18"/>
+    <w:abstractNumId w:val="19"/>
   </w:num>
   <w:num w:numId="11">
     <w:abstractNumId w:val="3"/>
   </w:num>
   <w:num w:numId="12">
-    <w:abstractNumId w:val="19"/>
+    <w:abstractNumId w:val="20"/>
   </w:num>
   <w:num w:numId="13">
-    <w:abstractNumId w:val="16"/>
+    <w:abstractNumId w:val="17"/>
   </w:num>
   <w:num w:numId="14">
     <w:abstractNumId w:val="14"/>
@@ -3306,7 +3819,7 @@
     <w:abstractNumId w:val="10"/>
   </w:num>
   <w:num w:numId="16">
-    <w:abstractNumId w:val="23"/>
+    <w:abstractNumId w:val="24"/>
   </w:num>
   <w:num w:numId="17">
     <w:abstractNumId w:val="9"/>
@@ -3315,16 +3828,16 @@
     <w:abstractNumId w:val="0"/>
   </w:num>
   <w:num w:numId="19">
-    <w:abstractNumId w:val="17"/>
+    <w:abstractNumId w:val="18"/>
   </w:num>
   <w:num w:numId="20">
-    <w:abstractNumId w:val="22"/>
+    <w:abstractNumId w:val="23"/>
   </w:num>
   <w:num w:numId="21">
     <w:abstractNumId w:val="1"/>
   </w:num>
   <w:num w:numId="22">
-    <w:abstractNumId w:val="15"/>
+    <w:abstractNumId w:val="16"/>
   </w:num>
   <w:num w:numId="23">
     <w:abstractNumId w:val="4"/>
@@ -3333,10 +3846,13 @@
     <w:abstractNumId w:val="11"/>
   </w:num>
   <w:num w:numId="25">
-    <w:abstractNumId w:val="25"/>
+    <w:abstractNumId w:val="26"/>
   </w:num>
   <w:num w:numId="26">
     <w:abstractNumId w:val="2"/>
+  </w:num>
+  <w:num w:numId="27">
+    <w:abstractNumId w:val="15"/>
   </w:num>
 </w:numbering>
 </file>

</xml_diff>